<commit_message>
docs: DB 설명서를 MongoDB 전용으로 수정 (#112)
운영 DB는 MongoDB만 사용한다는 점을 명확히 하고,
PostgreSQL 레거시 문구를 구제품 이전용 참고로 정리한다.

Co-authored-by: Cursor Agent <cursoragent@cursor.com>
Co-authored-by: hanbaedal <hanbaedal@users.noreply.github.com>
</commit_message>
<xml_diff>
--- a/docs/빠몽이_DB구조_설명서.docx
+++ b/docs/빠몽이_DB구조_설명서.docx
@@ -27,7 +27,7 @@
           <w:color w:val="555555"/>
           <w:sz w:val="22"/>
         </w:rPr>
-        <w:t>MongoDB 중심 · PostgreSQL 레거시 동기화</w:t>
+        <w:t>운영 DB = MongoDB 전용</w:t>
       </w:r>
     </w:p>
     <w:p/>
@@ -54,7 +54,7 @@
           <w:b w:val="0"/>
           <w:sz w:val="22"/>
         </w:rPr>
-        <w:t>운영 기본 저장소는 MongoDB입니다.</w:t>
+        <w:t>빠몽이(PPAMONG)의 운영·런타임 데이터베이스는 MongoDB만 사용합니다.</w:t>
       </w:r>
     </w:p>
     <w:p>
@@ -67,7 +67,7 @@
           <w:b w:val="0"/>
           <w:sz w:val="22"/>
         </w:rPr>
-        <w:t>일부 레거시 데이터는 PostgreSQL에 있으며, 슈퍼바이저 「디비 백업하기」에서 PG→Mongo 동기화·내보내기를 할 수 있습니다.</w:t>
+        <w:t>서버는 MONGODB_URI 없이 기동하지 않습니다. 회원·경기·예측·몰·관리자 데이터는 모두 MongoDB 컬렉션에 저장됩니다.</w:t>
       </w:r>
     </w:p>
     <w:p>
@@ -80,7 +80,20 @@
           <w:b w:val="0"/>
           <w:sz w:val="22"/>
         </w:rPr>
-        <w:t>상세 ERD는 docs/db-erd.md를 참고합니다.</w:t>
+        <w:t>구제품(빠던9 등)이 쓰던 PostgreSQL은 빠몽이 운영 DB가 아닙니다. 일상 운영·백업·복구는 MongoDB 기준입니다.</w:t>
+      </w:r>
+    </w:p>
+    <w:p>
+      <w:pPr>
+        <w:pStyle w:val="ListBullet"/>
+      </w:pPr>
+      <w:r>
+        <w:rPr>
+          <w:rFonts w:ascii="맑은 고딕" w:hAnsi="맑은 고딕" w:eastAsia="맑은 고딕"/>
+          <w:b w:val="0"/>
+          <w:sz w:val="22"/>
+        </w:rPr>
+        <w:t>컬렉션 관계는 docs/db-erd.md(구 ERD는 참고용)와 본 문서의 표를 함께 보세요.</w:t>
       </w:r>
     </w:p>
     <w:tbl>
@@ -599,7 +612,7 @@
           <w:b/>
           <w:sz w:val="28"/>
         </w:rPr>
-        <w:t>3. 백업·동기화</w:t>
+        <w:t>3. 백업</w:t>
       </w:r>
     </w:p>
     <w:p>
@@ -625,7 +638,20 @@
           <w:b w:val="0"/>
           <w:sz w:val="22"/>
         </w:rPr>
-        <w:t>테이블별 Mongo 내보내기, PostgreSQL→Mongo 동기화 지원</w:t>
+        <w:t>MongoDB 컬렉션/테이블별 내보내기(백업)를 사용합니다.</w:t>
+      </w:r>
+    </w:p>
+    <w:p>
+      <w:pPr>
+        <w:pStyle w:val="ListBullet"/>
+      </w:pPr>
+      <w:r>
+        <w:rPr>
+          <w:rFonts w:ascii="맑은 고딕" w:hAnsi="맑은 고딕" w:eastAsia="맑은 고딕"/>
+          <w:b w:val="0"/>
+          <w:sz w:val="22"/>
+        </w:rPr>
+        <w:t>관리자 화면에 남아 있는 PostgreSQL 가져오기 메뉴는 구제품 일회성 이전용이며, 빠몽이 정상 운영에 필요하지 않습니다.</w:t>
       </w:r>
     </w:p>
     <w:p>

</xml_diff>